<commit_message>
fix(kp-doc): update header contact info, add test result summary
Header block in the КП (correction program) .docx template still had the
old site/phone/email. Update to current contact info:
- site: https://good-teach.online/ (was houch-school.ru, plus dropped a
  stray "/ruschoolru" leftover appended to the hyperlink text)
- phones: 8 800 350-54-34 (unchanged), +7 901 960-68-10 (was +7 937 855-15-67)
- email: info@houch-school.ru (was hello@shkolaonline.com)

Also add a text line right after the topics table with the test result:
percentage, error count and total task count, so the program includes the
actual test outcome instead of only the correction plan.
</commit_message>
<xml_diff>
--- a/backend/templates/kp-template.docx
+++ b/backend/templates/kp-template.docx
@@ -154,7 +154,7 @@
               </w:rPr>
             </w:pPr>
             <w:r/>
-            <w:hyperlink r:id="rId9" w:tooltip="https://houch-school.ru" w:history="1">
+            <w:hyperlink r:id="rId9" w:tooltip="https://good-teach.online/" w:history="1">
               <w:r>
                 <w:rPr>
                   <w:rFonts w:ascii="Times New Roman" w:hAnsi="Times New Roman" w:eastAsia="Times New Roman" w:cs="Times New Roman"/>
@@ -164,7 +164,7 @@
                   <w:u w:val="single"/>
                   <w:lang w:val="en-US"/>
                 </w:rPr>
-                <w:t xml:space="preserve">https://houch-school.ru</w:t>
+                <w:t xml:space="preserve">https://good-teach.online/</w:t>
               </w:r>
             </w:hyperlink>
             <w:r>
@@ -176,7 +176,6 @@
                 <w:u w:val="single"/>
                 <w:lang w:val="en-US"/>
               </w:rPr>
-              <w:t xml:space="preserve">/ruschoolru</w:t>
             </w:r>
             <w:r>
               <w:rPr>
@@ -215,7 +214,7 @@
                 <w:szCs w:val="28"/>
                 <w:lang w:val="en-US"/>
               </w:rPr>
-              <w:t xml:space="preserve">: +7 937 855-15-67</w:t>
+              <w:t xml:space="preserve">: +7 901 960-68-10</w:t>
             </w:r>
             <w:r>
               <w:rPr>
@@ -291,7 +290,7 @@
                 <w:szCs w:val="28"/>
                 <w:u w:val="single"/>
               </w:rPr>
-              <w:t xml:space="preserve">hello@shkolaonline.com</w:t>
+              <w:t xml:space="preserve">info@houch-school.ru</w:t>
             </w:r>
             <w:r>
               <w:rPr>

</xml_diff>